<commit_message>
Add portfolio link to downloadable CV
</commit_message>
<xml_diff>
--- a/public/assets/Ramadan_Mohamed_CV.docx
+++ b/public/assets/Ramadan_Mohamed_CV.docx
@@ -45,7 +45,7 @@
         <w:rPr>
           <w:color w:val="1F1F1F"/>
         </w:rPr>
-        <w:t>Email: rm3176602@gmail.com | Phone: 01000319057 | LinkedIn: www.linkedin.com/in/ramadan-mohamed-657686365</w:t>
+        <w:t>Email: rm3176602@gmail.com | Phone: 01000319057 | LinkedIn: www.linkedin.com/in/ramadan-mohamed-657686365 | Portfolio: https://ramadan-ai-portfolio.vercel.app/</w:t>
       </w:r>
     </w:p>
     <w:p>
@@ -142,7 +142,7 @@
         <w:rPr>
           <w:color w:val="1F1F1F"/>
         </w:rPr>
-        <w:t>Computer Science, Artificial Intelligence Program | (September 2022 – June 2026)</w:t>
+        <w:t>Computer Science, Artificial Intelligence Program | (September 2022 â€“ June 2026)</w:t>
       </w:r>
     </w:p>
     <w:p>
@@ -187,7 +187,7 @@
         <w:rPr>
           <w:color w:val="1F1F1F"/>
         </w:rPr>
-        <w:t xml:space="preserve"> (March 2026 – May 2026)</w:t>
+        <w:t xml:space="preserve"> (March 2026 â€“ May 2026)</w:t>
       </w:r>
     </w:p>
     <w:p>
@@ -261,7 +261,7 @@
         <w:rPr>
           <w:color w:val="1F1F1F"/>
         </w:rPr>
-        <w:t xml:space="preserve"> (August 2025 – October 2025)</w:t>
+        <w:t xml:space="preserve"> (August 2025 â€“ October 2025)</w:t>
       </w:r>
     </w:p>
     <w:p>
@@ -335,7 +335,7 @@
         <w:rPr>
           <w:color w:val="1F1F1F"/>
         </w:rPr>
-        <w:t xml:space="preserve"> (July 2025 – August 2025)</w:t>
+        <w:t xml:space="preserve"> (July 2025 â€“ August 2025)</w:t>
       </w:r>
     </w:p>
     <w:p>
@@ -387,7 +387,7 @@
         <w:rPr>
           <w:color w:val="1F1F1F"/>
         </w:rPr>
-        <w:t xml:space="preserve"> (July 2025 – August 2025)</w:t>
+        <w:t xml:space="preserve"> (July 2025 â€“ August 2025)</w:t>
       </w:r>
     </w:p>
     <w:p>
@@ -439,7 +439,7 @@
         <w:rPr>
           <w:color w:val="1F1F1F"/>
         </w:rPr>
-        <w:t xml:space="preserve"> (June 2025 – July 2025)</w:t>
+        <w:t xml:space="preserve"> (June 2025 â€“ July 2025)</w:t>
       </w:r>
     </w:p>
     <w:p>
@@ -565,7 +565,7 @@
         <w:rPr>
           <w:color w:val="1F1F1F"/>
         </w:rPr>
-        <w:t>Developed a novel robotic path-planning algorithm combining random walk strategies with Dijkstra’s algorithm to optimize navigation efficiency.</w:t>
+        <w:t>Developed a novel robotic path-planning algorithm combining random walk strategies with Dijkstraâ€™s algorithm to optimize navigation efficiency.</w:t>
       </w:r>
     </w:p>
     <w:p>
@@ -852,7 +852,7 @@
         <w:rPr>
           <w:b/>
         </w:rPr>
-        <w:t>AGRINOVA – AI-Robotics &amp; IoT Framework with Blockchain:</w:t>
+        <w:t>AGRINOVA â€“ AI-Robotics &amp; IoT Framework with Blockchain:</w:t>
       </w:r>
       <w:r>
         <w:t xml:space="preserve"> Designed an Unmanned Aerial Vehicle (UAV) and Internet of Things (IoT) system using VGG16 transfer learning (96.9% accuracy) and Blockchain smart contracts to secure agricultural data.</w:t>
@@ -1100,7 +1100,7 @@
           <w:bCs/>
           <w:color w:val="1F1F1F"/>
         </w:rPr>
-        <w:t>2nd Place – MansTech Hackathon</w:t>
+        <w:t>2nd Place â€“ MansTech Hackathon</w:t>
       </w:r>
       <w:r>
         <w:rPr>
@@ -1128,7 +1128,7 @@
         <w:rPr>
           <w:b/>
         </w:rPr>
-        <w:t>1st Place – Computer Science and Engineering Projects Exhibition 2026</w:t>
+        <w:t>1st Place â€“ Computer Science and Engineering Projects Exhibition 2026</w:t>
       </w:r>
       <w:r>
         <w:t xml:space="preserve"> (May 2026): Awarded for AGRINOVA smart agriculture project, recognizing outstanding innovation, creativity, and technical excellence.</w:t>
@@ -1155,7 +1155,7 @@
           <w:bCs/>
           <w:color w:val="1F1F1F"/>
         </w:rPr>
-        <w:t>1st Place Award – Annual University Projects Exhibition</w:t>
+        <w:t>1st Place Award â€“ Annual University Projects Exhibition</w:t>
       </w:r>
       <w:r>
         <w:rPr>
@@ -1185,7 +1185,7 @@
           <w:bCs/>
           <w:color w:val="1F1F1F"/>
         </w:rPr>
-        <w:t>Certificate for Research Publication – Springer</w:t>
+        <w:t>Certificate for Research Publication â€“ Springer</w:t>
       </w:r>
       <w:r>
         <w:rPr>
@@ -1291,7 +1291,7 @@
         <w:rPr>
           <w:color w:val="1F1F1F"/>
         </w:rPr>
-        <w:t xml:space="preserve"> Python (Advanced – including data processing, scripting, automation, AI/ML integration), C, C++, C#, JavaScript, HTML5, CSS3</w:t>
+        <w:t xml:space="preserve"> Python (Advanced â€“ including data processing, scripting, automation, AI/ML integration), C, C++, C#, JavaScript, HTML5, CSS3</w:t>
       </w:r>
     </w:p>
     <w:p>

</xml_diff>